<commit_message>
correciones y documentación agregadas
</commit_message>
<xml_diff>
--- a/documentacion/Gobierno de datos/Matriz Raci- Orca.docx
+++ b/documentacion/Gobierno de datos/Matriz Raci- Orca.docx
@@ -96,12 +96,6 @@
         <w:gridCol w:w="3000"/>
       </w:tblGrid>
       <w:tr>
-        <w:tblPrEx>
-          <w:tblCellMar>
-            <w:top w:w="0" w:type="dxa"/>
-            <w:bottom w:w="0" w:type="dxa"/>
-          </w:tblCellMar>
-        </w:tblPrEx>
         <w:trPr>
           <w:tblHeader/>
         </w:trPr>
@@ -179,12 +173,6 @@
         </w:tc>
       </w:tr>
       <w:tr>
-        <w:tblPrEx>
-          <w:tblCellMar>
-            <w:top w:w="0" w:type="dxa"/>
-            <w:bottom w:w="0" w:type="dxa"/>
-          </w:tblCellMar>
-        </w:tblPrEx>
         <w:tc>
           <w:tcPr>
             <w:tcW w:w="3000" w:type="dxa"/>
@@ -250,12 +238,6 @@
         </w:tc>
       </w:tr>
       <w:tr>
-        <w:tblPrEx>
-          <w:tblCellMar>
-            <w:top w:w="0" w:type="dxa"/>
-            <w:bottom w:w="0" w:type="dxa"/>
-          </w:tblCellMar>
-        </w:tblPrEx>
         <w:tc>
           <w:tcPr>
             <w:tcW w:w="3000" w:type="dxa"/>
@@ -292,13 +274,11 @@
             </w:tcMar>
           </w:tcPr>
           <w:p>
-            <w:proofErr w:type="spellStart"/>
-            <w:r>
-              <w:t>Julian</w:t>
-            </w:r>
-            <w:proofErr w:type="spellEnd"/>
-            <w:r>
-              <w:t xml:space="preserve"> Amariles Taborda</w:t>
+            <w:r>
+              <w:t>Katheryn Ramírez Chimá</w:t>
+            </w:r>
+            <w:r>
+              <w:t xml:space="preserve"> </w:t>
             </w:r>
           </w:p>
         </w:tc>
@@ -326,12 +306,6 @@
         </w:tc>
       </w:tr>
       <w:tr>
-        <w:tblPrEx>
-          <w:tblCellMar>
-            <w:top w:w="0" w:type="dxa"/>
-            <w:bottom w:w="0" w:type="dxa"/>
-          </w:tblCellMar>
-        </w:tblPrEx>
         <w:tc>
           <w:tcPr>
             <w:tcW w:w="3000" w:type="dxa"/>
@@ -369,7 +343,7 @@
           </w:tcPr>
           <w:p>
             <w:r>
-              <w:t>Katheryn Ramírez Chimá</w:t>
+              <w:t>Julian Amariles Taborda</w:t>
             </w:r>
           </w:p>
         </w:tc>
@@ -397,12 +371,6 @@
         </w:tc>
       </w:tr>
       <w:tr>
-        <w:tblPrEx>
-          <w:tblCellMar>
-            <w:top w:w="0" w:type="dxa"/>
-            <w:bottom w:w="0" w:type="dxa"/>
-          </w:tblCellMar>
-        </w:tblPrEx>
         <w:tc>
           <w:tcPr>
             <w:tcW w:w="3000" w:type="dxa"/>
@@ -439,21 +407,8 @@
             </w:tcMar>
           </w:tcPr>
           <w:p>
-            <w:proofErr w:type="spellStart"/>
-            <w:r>
-              <w:t>Jhon</w:t>
-            </w:r>
-            <w:proofErr w:type="spellEnd"/>
-            <w:r>
-              <w:t xml:space="preserve"> </w:t>
-            </w:r>
-            <w:proofErr w:type="spellStart"/>
-            <w:r>
-              <w:t>Sebastian</w:t>
-            </w:r>
-            <w:proofErr w:type="spellEnd"/>
-            <w:r>
-              <w:t xml:space="preserve"> Rayo Posada</w:t>
+            <w:r>
+              <w:t>Jhon Sebastian Rayo Posada</w:t>
             </w:r>
           </w:p>
         </w:tc>
@@ -566,12 +521,6 @@
         <w:gridCol w:w="1500"/>
       </w:tblGrid>
       <w:tr>
-        <w:tblPrEx>
-          <w:tblCellMar>
-            <w:top w:w="0" w:type="dxa"/>
-            <w:bottom w:w="0" w:type="dxa"/>
-          </w:tblCellMar>
-        </w:tblPrEx>
         <w:trPr>
           <w:tblHeader/>
         </w:trPr>
@@ -709,12 +658,6 @@
         </w:tc>
       </w:tr>
       <w:tr>
-        <w:tblPrEx>
-          <w:tblCellMar>
-            <w:top w:w="0" w:type="dxa"/>
-            <w:bottom w:w="0" w:type="dxa"/>
-          </w:tblCellMar>
-        </w:tblPrEx>
         <w:tc>
           <w:tcPr>
             <w:tcW w:w="3360" w:type="dxa"/>
@@ -819,12 +762,6 @@
         </w:tc>
       </w:tr>
       <w:tr>
-        <w:tblPrEx>
-          <w:tblCellMar>
-            <w:top w:w="0" w:type="dxa"/>
-            <w:bottom w:w="0" w:type="dxa"/>
-          </w:tblCellMar>
-        </w:tblPrEx>
         <w:tc>
           <w:tcPr>
             <w:tcW w:w="3360" w:type="dxa"/>
@@ -929,12 +866,6 @@
         </w:tc>
       </w:tr>
       <w:tr>
-        <w:tblPrEx>
-          <w:tblCellMar>
-            <w:top w:w="0" w:type="dxa"/>
-            <w:bottom w:w="0" w:type="dxa"/>
-          </w:tblCellMar>
-        </w:tblPrEx>
         <w:tc>
           <w:tcPr>
             <w:tcW w:w="3360" w:type="dxa"/>
@@ -1039,12 +970,6 @@
         </w:tc>
       </w:tr>
       <w:tr>
-        <w:tblPrEx>
-          <w:tblCellMar>
-            <w:top w:w="0" w:type="dxa"/>
-            <w:bottom w:w="0" w:type="dxa"/>
-          </w:tblCellMar>
-        </w:tblPrEx>
         <w:tc>
           <w:tcPr>
             <w:tcW w:w="3360" w:type="dxa"/>
@@ -1146,12 +1071,6 @@
         </w:tc>
       </w:tr>
       <w:tr>
-        <w:tblPrEx>
-          <w:tblCellMar>
-            <w:top w:w="0" w:type="dxa"/>
-            <w:bottom w:w="0" w:type="dxa"/>
-          </w:tblCellMar>
-        </w:tblPrEx>
         <w:tc>
           <w:tcPr>
             <w:tcW w:w="3360" w:type="dxa"/>
@@ -1256,12 +1175,6 @@
         </w:tc>
       </w:tr>
       <w:tr>
-        <w:tblPrEx>
-          <w:tblCellMar>
-            <w:top w:w="0" w:type="dxa"/>
-            <w:bottom w:w="0" w:type="dxa"/>
-          </w:tblCellMar>
-        </w:tblPrEx>
         <w:tc>
           <w:tcPr>
             <w:tcW w:w="3360" w:type="dxa"/>
@@ -1366,12 +1279,6 @@
         </w:tc>
       </w:tr>
       <w:tr>
-        <w:tblPrEx>
-          <w:tblCellMar>
-            <w:top w:w="0" w:type="dxa"/>
-            <w:bottom w:w="0" w:type="dxa"/>
-          </w:tblCellMar>
-        </w:tblPrEx>
         <w:tc>
           <w:tcPr>
             <w:tcW w:w="3360" w:type="dxa"/>
@@ -1504,7 +1411,6 @@
         </w:rPr>
         <w:t xml:space="preserve"> Responsible · </w:t>
       </w:r>
-      <w:proofErr w:type="gramStart"/>
       <w:r>
         <w:rPr>
           <w:b/>
@@ -1514,7 +1420,6 @@
         </w:rPr>
         <w:t>A</w:t>
       </w:r>
-      <w:proofErr w:type="gramEnd"/>
       <w:r>
         <w:rPr>
           <w:color w:val="333333"/>
@@ -2259,6 +2164,7 @@
   <w:style w:type="character" w:default="1" w:styleId="Fuentedeprrafopredeter">
     <w:name w:val="Default Paragraph Font"/>
     <w:uiPriority w:val="1"/>
+    <w:semiHidden/>
     <w:unhideWhenUsed/>
   </w:style>
   <w:style w:type="table" w:default="1" w:styleId="Tablanormal">

</xml_diff>